<commit_message>
Make local database primary for cloud sync
</commit_message>
<xml_diff>
--- a/docs/word/RestaurantOS_Documentation_Pack_OnPrem.docx
+++ b/docs/word/RestaurantOS_Documentation_Pack_OnPrem.docx
@@ -1666,7 +1666,7 @@
         <w:rPr>
           <w:b w:val="0"/>
         </w:rPr>
-        <w:t>Railway deployment is intentionally not pushed while the Railway subscription is expired.</w:t>
+        <w:t>Railway deployment is permitted after subscription renewal and should be verified after each reviewed release.</w:t>
       </w:r>
     </w:p>
     <w:p>
@@ -1900,7 +1900,7 @@
         <w:rPr>
           <w:b w:val="0"/>
         </w:rPr>
-        <w:t>Offline local mode, sync queue, cloud push, and cloud-to-local master data pull.</w:t>
+        <w:t>Offline local mode, sync queue, local-to-cloud operational/master-data push, and cloud-to-local subscription-result pull.</w:t>
       </w:r>
     </w:p>
     <w:p>
@@ -1941,7 +1941,7 @@
         <w:rPr>
           <w:b w:val="0"/>
         </w:rPr>
-        <w:t>Production Railway deployment while Railway subscription is expired.</w:t>
+        <w:t>Production Railway availability and environment ownership outside the controlled test window.</w:t>
       </w:r>
     </w:p>
     <w:p>
@@ -2891,7 +2891,7 @@
               <w:rPr>
                 <w:b w:val="0"/>
               </w:rPr>
-              <w:t>Deferred until Railway subscription is renewed.</w:t>
+              <w:t>Available for verified release deployment.</w:t>
             </w:r>
           </w:p>
         </w:tc>
@@ -6501,7 +6501,7 @@
               <w:rPr>
                 <w:b w:val="0"/>
               </w:rPr>
-              <w:t>Create category online</w:t>
+              <w:t>Create category locally</w:t>
             </w:r>
           </w:p>
         </w:tc>
@@ -6526,7 +6526,7 @@
               <w:rPr>
                 <w:b w:val="0"/>
               </w:rPr>
-              <w:t>Add category in online/cloud mode.</w:t>
+              <w:t>Add category in local-primary mode while connected.</w:t>
             </w:r>
           </w:p>
         </w:tc>
@@ -6551,7 +6551,7 @@
               <w:rPr>
                 <w:b w:val="0"/>
               </w:rPr>
-              <w:t>Category appears locally after master data pull.</w:t>
+              <w:t>Category saves locally and appears in cloud after sync.</w:t>
             </w:r>
           </w:p>
         </w:tc>
@@ -6603,7 +6603,7 @@
               <w:rPr>
                 <w:b w:val="0"/>
               </w:rPr>
-              <w:t>Create menu item online</w:t>
+              <w:t>Create menu item locally</w:t>
             </w:r>
           </w:p>
         </w:tc>
@@ -6628,7 +6628,7 @@
               <w:rPr>
                 <w:b w:val="0"/>
               </w:rPr>
-              <w:t>Add item, variants, image.</w:t>
+              <w:t>Add item, variants, and image in local-primary mode.</w:t>
             </w:r>
           </w:p>
         </w:tc>
@@ -6653,7 +6653,7 @@
               <w:rPr>
                 <w:b w:val="0"/>
               </w:rPr>
-              <w:t>POS displays item and offline cache localizes image.</w:t>
+              <w:t>POS displays item locally and cloud receives the item after sync.</w:t>
             </w:r>
           </w:p>
         </w:tc>
@@ -6705,7 +6705,7 @@
               <w:rPr>
                 <w:b w:val="0"/>
               </w:rPr>
-              <w:t>Block local master edits</w:t>
+              <w:t>Local master-data edit sync</w:t>
             </w:r>
           </w:p>
         </w:tc>
@@ -6730,7 +6730,7 @@
               <w:rPr>
                 <w:b w:val="0"/>
               </w:rPr>
-              <w:t>Attempt menu/inventory master edit in offline local mode.</w:t>
+              <w:t>Create or edit menu/inventory master data in offline local mode, then reconnect.</w:t>
             </w:r>
           </w:p>
         </w:tc>
@@ -6755,7 +6755,7 @@
               <w:rPr>
                 <w:b w:val="0"/>
               </w:rPr>
-              <w:t>System rejects cloud-owned master edit.</w:t>
+              <w:t>Local edit is accepted, queued, and appears in cloud after sync.</w:t>
             </w:r>
           </w:p>
         </w:tc>
@@ -12183,7 +12183,7 @@
         <w:rPr>
           <w:b w:val="0"/>
         </w:rPr>
-        <w:t>Menu and item setup is cloud-managed in offline architecture. Add or update master data from online/cloud mode.</w:t>
+        <w:t>Menu and item setup is local-primary in the on-premise offline architecture. Add or update master data from the local server; it syncs to cloud when connectivity is available.</w:t>
       </w:r>
     </w:p>
     <w:p>
@@ -12238,7 +12238,7 @@
         <w:rPr>
           <w:b w:val="0"/>
         </w:rPr>
-        <w:t>Local offline servers pull the updated master data from cloud.</w:t>
+        <w:t>The local server pushes updated master data to cloud when connectivity is available.</w:t>
       </w:r>
     </w:p>
     <w:p>
@@ -13114,7 +13114,7 @@
         <w:rPr>
           <w:b w:val="0"/>
         </w:rPr>
-        <w:t>Master data is cloud-owned:</w:t>
+        <w:t>Master data is local-owned:</w:t>
       </w:r>
     </w:p>
     <w:p>
@@ -14349,7 +14349,7 @@
                 <w:color w:val="2D3748"/>
                 <w:sz w:val="17"/>
               </w:rPr>
-              <w:t xml:space="preserve">  B --&gt;|"Master data read"| K["Pull cloud master snapshot"]</w:t>
+              <w:t xml:space="preserve">  B --&gt;|"Subscription approval result"| K["Pull approved subscription state"]</w:t>
             </w:r>
             <w:r>
               <w:br/>
@@ -14453,7 +14453,7 @@
                 <w:color w:val="2D3748"/>
                 <w:sz w:val="17"/>
               </w:rPr>
-              <w:t xml:space="preserve">  B --&gt;|"Cloud/online"| C["Allow create/update/delete"]</w:t>
+              <w:t xml:space="preserve">  B --&gt;|"Local primary"| C["Allow create/update/delete"]</w:t>
             </w:r>
             <w:r>
               <w:br/>
@@ -14464,7 +14464,7 @@
                 <w:color w:val="2D3748"/>
                 <w:sz w:val="17"/>
               </w:rPr>
-              <w:t xml:space="preserve">  C --&gt; D["Save to Neon"]</w:t>
+              <w:t xml:space="preserve">  C --&gt; D["Save to local PostgreSQL"]</w:t>
             </w:r>
             <w:r>
               <w:br/>
@@ -14475,7 +14475,7 @@
                 <w:color w:val="2D3748"/>
                 <w:sz w:val="17"/>
               </w:rPr>
-              <w:t xml:space="preserve">  D --&gt; E["Local servers pull updates"]</w:t>
+              <w:t xml:space="preserve">  D --&gt; E["Queue and push snapshot to Neon"]</w:t>
             </w:r>
             <w:r>
               <w:br/>
@@ -14486,7 +14486,7 @@
                 <w:color w:val="2D3748"/>
                 <w:sz w:val="17"/>
               </w:rPr>
-              <w:t xml:space="preserve">  B --&gt;|"Local offline"| F["Reject cloud-owned master edit"]</w:t>
+              <w:t xml:space="preserve">  B --&gt;|"Cloud/online"| F["Reject local-owned master edit"]</w:t>
             </w:r>
             <w:r>
               <w:br/>
@@ -14497,7 +14497,7 @@
                 <w:color w:val="2D3748"/>
                 <w:sz w:val="17"/>
               </w:rPr>
-              <w:t xml:space="preserve">  F --&gt; G["User performs edit in cloud instead"]</w:t>
+              <w:t xml:space="preserve">  F --&gt; G["User performs edit on local server"]</w:t>
             </w:r>
             <w:r>
               <w:br/>
@@ -15977,7 +15977,7 @@
         <w:pStyle w:val="Heading2"/>
       </w:pPr>
       <w:r>
-        <w:t>5. Cloud Master Data Pull</w:t>
+        <w:t>5. Local Master Data Push</w:t>
       </w:r>
     </w:p>
     <w:p>
@@ -16036,7 +16036,7 @@
                 <w:color w:val="2D3748"/>
                 <w:sz w:val="17"/>
               </w:rPr>
-              <w:t xml:space="preserve">  participant Worker as Local Sync Worker</w:t>
+              <w:t xml:space="preserve">  participant Manager</w:t>
             </w:r>
             <w:r>
               <w:br/>
@@ -16047,7 +16047,7 @@
                 <w:color w:val="2D3748"/>
                 <w:sz w:val="17"/>
               </w:rPr>
-              <w:t xml:space="preserve">  participant CloudAPI as Cloud API</w:t>
+              <w:t xml:space="preserve">  participant LocalAPI as Local API</w:t>
             </w:r>
             <w:r>
               <w:br/>
@@ -16058,7 +16058,7 @@
                 <w:color w:val="2D3748"/>
                 <w:sz w:val="17"/>
               </w:rPr>
-              <w:t xml:space="preserve">  participant Neon as Neon PostgreSQL</w:t>
+              <w:t xml:space="preserve">  participant LocalDB as Local PostgreSQL</w:t>
             </w:r>
             <w:r>
               <w:br/>
@@ -16069,7 +16069,7 @@
                 <w:color w:val="2D3748"/>
                 <w:sz w:val="17"/>
               </w:rPr>
-              <w:t xml:space="preserve">  participant LocalDB as Local PostgreSQL</w:t>
+              <w:t xml:space="preserve">  participant Worker as Local Sync Worker</w:t>
             </w:r>
             <w:r>
               <w:br/>
@@ -16080,7 +16080,7 @@
                 <w:color w:val="2D3748"/>
                 <w:sz w:val="17"/>
               </w:rPr>
-              <w:t xml:space="preserve">  participant Cache as Offline Image Cache</w:t>
+              <w:t xml:space="preserve">  participant CloudAPI as Cloud API</w:t>
             </w:r>
             <w:r>
               <w:br/>
@@ -16091,6 +16091,7 @@
                 <w:color w:val="2D3748"/>
                 <w:sz w:val="17"/>
               </w:rPr>
+              <w:t xml:space="preserve">  participant Neon as Neon PostgreSQL</w:t>
             </w:r>
             <w:r>
               <w:br/>
@@ -16101,7 +16102,6 @@
                 <w:color w:val="2D3748"/>
                 <w:sz w:val="17"/>
               </w:rPr>
-              <w:t xml:space="preserve">  Worker-&gt;&gt;CloudAPI: POST /api/sync/master-data</w:t>
             </w:r>
             <w:r>
               <w:br/>
@@ -16112,7 +16112,7 @@
                 <w:color w:val="2D3748"/>
                 <w:sz w:val="17"/>
               </w:rPr>
-              <w:t xml:space="preserve">  CloudAPI-&gt;&gt;Neon: Read restaurants and master entities</w:t>
+              <w:t xml:space="preserve">  Manager-&gt;&gt;LocalAPI: Add or modify menu/inventory/staff setup</w:t>
             </w:r>
             <w:r>
               <w:br/>
@@ -16123,7 +16123,7 @@
                 <w:color w:val="2D3748"/>
                 <w:sz w:val="17"/>
               </w:rPr>
-              <w:t xml:space="preserve">  Neon--&gt;&gt;CloudAPI: Master data snapshots</w:t>
+              <w:t xml:space="preserve">  LocalAPI-&gt;&gt;LocalDB: Save master record</w:t>
             </w:r>
             <w:r>
               <w:br/>
@@ -16134,7 +16134,7 @@
                 <w:color w:val="2D3748"/>
                 <w:sz w:val="17"/>
               </w:rPr>
-              <w:t xml:space="preserve">  CloudAPI--&gt;&gt;Worker: master_data_pull payload</w:t>
+              <w:t xml:space="preserve">  LocalAPI-&gt;&gt;LocalDB: Queue master_data_snapshot</w:t>
             </w:r>
             <w:r>
               <w:br/>
@@ -16145,7 +16145,7 @@
                 <w:color w:val="2D3748"/>
                 <w:sz w:val="17"/>
               </w:rPr>
-              <w:t xml:space="preserve">  Worker-&gt;&gt;LocalDB: Upsert master rows</w:t>
+              <w:t xml:space="preserve">  Worker-&gt;&gt;CloudAPI: POST /api/sync/ingest</w:t>
             </w:r>
             <w:r>
               <w:br/>
@@ -16156,7 +16156,7 @@
                 <w:color w:val="2D3748"/>
                 <w:sz w:val="17"/>
               </w:rPr>
-              <w:t xml:space="preserve">  Worker-&gt;&gt;Cache: Localize menu images</w:t>
+              <w:t xml:space="preserve">  CloudAPI-&gt;&gt;Neon: Upsert local-owned master snapshot</w:t>
             </w:r>
             <w:r>
               <w:br/>
@@ -16167,7 +16167,18 @@
                 <w:color w:val="2D3748"/>
                 <w:sz w:val="17"/>
               </w:rPr>
-              <w:t xml:space="preserve">  Cache-&gt;&gt;LocalDB: Rewrite local image URLs</w:t>
+              <w:t xml:space="preserve">  CloudAPI--&gt;&gt;Worker: Success</w:t>
+            </w:r>
+            <w:r>
+              <w:br/>
+            </w:r>
+            <w:r>
+              <w:rPr>
+                <w:rFonts w:ascii="Consolas" w:hAnsi="Consolas" w:eastAsia="Consolas"/>
+                <w:color w:val="2D3748"/>
+                <w:sz w:val="17"/>
+              </w:rPr>
+              <w:t xml:space="preserve">  Worker-&gt;&gt;LocalDB: Mark queue item synced</w:t>
             </w:r>
           </w:p>
         </w:tc>
@@ -16976,7 +16987,7 @@
         <w:rPr>
           <w:b w:val="0"/>
         </w:rPr>
-        <w:t>RestaurantOS is a multi-tenant SaaS restaurant management platform built with React, Node.js, Express, Socket.IO, and PostgreSQL. It supports cloud mode through Neon PostgreSQL and local offline mode through a Dockerized local server and local PostgreSQL database. Offline mode uses a sync queue for operational writes and cloud pull for master data.</w:t>
+        <w:t>RestaurantOS is a multi-tenant SaaS restaurant management platform built with React, Node.js, Express, Socket.IO, and PostgreSQL. It supports cloud mode through Neon PostgreSQL and local offline mode through a Dockerized local server and local PostgreSQL database. In the local-primary deployment model, offline mode queues operational and master-data writes for push to cloud, while cloud approval results such as subscriptions can be returned to local.</w:t>
       </w:r>
     </w:p>
     <w:p>
@@ -17006,7 +17017,7 @@
         <w:rPr>
           <w:b w:val="0"/>
         </w:rPr>
-        <w:t>Keep master data controlled centrally from cloud to avoid conflicts.</w:t>
+        <w:t>Keep restaurant master data controlled from the local primary server to avoid conflicts.</w:t>
       </w:r>
     </w:p>
     <w:p>
@@ -17748,7 +17759,7 @@
               <w:rPr>
                 <w:b w:val="0"/>
               </w:rPr>
-              <w:t>Main SaaS operation, admin approval, master data management.</w:t>
+              <w:t>Cloud reporting, platform administration, and subscription approval.</w:t>
             </w:r>
           </w:p>
         </w:tc>
@@ -18086,7 +18097,7 @@
               <w:rPr>
                 <w:b w:val="0"/>
               </w:rPr>
-              <w:t>Push operational data to cloud and pull master data from cloud.</w:t>
+              <w:t>Push operational and master data to cloud; pull subscription approval results from cloud.</w:t>
             </w:r>
           </w:p>
         </w:tc>
@@ -18710,7 +18721,7 @@
               <w:rPr>
                 <w:b w:val="0"/>
               </w:rPr>
-              <w:t>Pushes local operational queue and pulls cloud master data.</w:t>
+              <w:t>Pushes local operational/master-data queue and pulls cloud approval results.</w:t>
             </w:r>
           </w:p>
         </w:tc>
@@ -19863,7 +19874,7 @@
         <w:pStyle w:val="Heading3"/>
       </w:pPr>
       <w:r>
-        <w:t>Cloud-Owned Master Data</w:t>
+        <w:t>Local-Owned Master Data</w:t>
       </w:r>
     </w:p>
     <w:p>
@@ -19871,7 +19882,7 @@
         <w:rPr>
           <w:b w:val="0"/>
         </w:rPr>
-        <w:t>The following should be added or modified from cloud/online mode to avoid conflicts:</w:t>
+        <w:t>The following should be added or modified from local/offline mode to avoid conflicts:</w:t>
       </w:r>
     </w:p>
     <w:p>
@@ -20790,7 +20801,7 @@
               <w:rPr>
                 <w:b w:val="0"/>
               </w:rPr>
-              <w:t>Cloud to local</w:t>
+              <w:t>Local to cloud</w:t>
             </w:r>
           </w:p>
         </w:tc>
@@ -20815,7 +20826,7 @@
               <w:rPr>
                 <w:b w:val="0"/>
               </w:rPr>
-              <w:t>Cloud-owned setup/master data.</w:t>
+              <w:t>Local-owned setup/master data.</w:t>
             </w:r>
           </w:p>
         </w:tc>
@@ -21153,7 +21164,7 @@
               <w:rPr>
                 <w:b w:val="0"/>
               </w:rPr>
-              <w:t>Protected offline sync ingest and master data pull.</w:t>
+              <w:t>Protected offline sync ingest and subscription-result pull.</w:t>
             </w:r>
           </w:p>
         </w:tc>
@@ -21796,7 +21807,7 @@
         <w:rPr>
           <w:b w:val="0"/>
         </w:rPr>
-        <w:t>Do not deploy to Railway until the user confirms the Railway subscription is renewed.</w:t>
+        <w:t>Railway deployment is enabled now that the subscription has been renewed; deploy from the reviewed main branch and verify health after release.</w:t>
       </w:r>
     </w:p>
     <w:p>
@@ -26356,7 +26367,18 @@
         <w:rPr>
           <w:b w:val="0"/>
         </w:rPr>
-        <w:t>Master data remains cloud-owned and pulls down to the local server.</w:t>
+        <w:t>Master data, including menu, inventory setup, staff, roles, recipes, tables, discounts, and restaurant setup, is maintained on the local server and pushed to cloud.</w:t>
+      </w:r>
+    </w:p>
+    <w:p>
+      <w:pPr>
+        <w:pStyle w:val="ListBullet"/>
+      </w:pPr>
+      <w:r>
+        <w:rPr>
+          <w:b w:val="0"/>
+        </w:rPr>
+        <w:t>The cloud deployment returns subscription approvals to the local server, because those approvals are super-admin decisions.</w:t>
       </w:r>
     </w:p>
     <w:p>

</xml_diff>